<commit_message>
Update Statistics Dashboard Documentation.docx
</commit_message>
<xml_diff>
--- a/Documentation/Statistics Dashboard Documentation.docx
+++ b/Documentation/Statistics Dashboard Documentation.docx
@@ -18,7 +18,7 @@
           <w:u w:val="single"/>
           <w:rtl w:val="0"/>
         </w:rPr>
-        <w:t xml:space="preserve">Assign Roles to New Users Documentation</w:t>
+        <w:t xml:space="preserve">Statistics Dashboard Documentation</w:t>
       </w:r>
     </w:p>
     <w:p>
@@ -90,12 +90,12 @@
           <wp:inline distB="114300" distT="114300" distL="114300" distR="114300">
             <wp:extent cx="2021927" cy="6110288"/>
             <wp:effectExtent b="0" l="0" r="0" t="0"/>
-            <wp:docPr id="2" name="image1.png"/>
+            <wp:docPr id="2" name="image3.png"/>
             <a:graphic>
               <a:graphicData uri="http://schemas.openxmlformats.org/drawingml/2006/picture">
                 <pic:pic>
                   <pic:nvPicPr>
-                    <pic:cNvPr id="0" name="image1.png"/>
+                    <pic:cNvPr id="0" name="image3.png"/>
                     <pic:cNvPicPr preferRelativeResize="0"/>
                   </pic:nvPicPr>
                   <pic:blipFill>
@@ -166,12 +166,12 @@
           <wp:inline distB="114300" distT="114300" distL="114300" distR="114300">
             <wp:extent cx="5943600" cy="2997200"/>
             <wp:effectExtent b="0" l="0" r="0" t="0"/>
-            <wp:docPr id="3" name="image3.png"/>
+            <wp:docPr id="3" name="image1.png"/>
             <a:graphic>
               <a:graphicData uri="http://schemas.openxmlformats.org/drawingml/2006/picture">
                 <pic:pic>
                   <pic:nvPicPr>
-                    <pic:cNvPr id="0" name="image3.png"/>
+                    <pic:cNvPr id="0" name="image1.png"/>
                     <pic:cNvPicPr preferRelativeResize="0"/>
                   </pic:nvPicPr>
                   <pic:blipFill>

</xml_diff>